<commit_message>
Fill ordinance brackets (submit-ready) + add 'What the City Gave Up' exhibit
- Fill all 16 local-policy brackets in the ordinance .docx with recommended values; schedule now records each proposed value (formatting preserved)
- New exhibit.html: stark bilingual 'gave vs got' scoreboard + surrendered-oversight list, sourced to the signed agreements
- Surface the exhibit from the hero and the 'What's being built' section
- Update ordinance page to note values are filled (City Attorney to confirm)
</commit_message>
<xml_diff>
--- a/documents/El_Paso_Data_Center_Ordinance_DRAFT.docx
+++ b/documents/El_Paso_Data_Center_Ordinance_DRAFT.docx
@@ -717,7 +717,7 @@
           <w:sz w:val="22"/>
           <w:szCs w:val="22"/>
         </w:rPr>
-        <w:t xml:space="preserve">"Environmentally sensitive area" means a mapped floodplain, an arroyo or stormwater conveyance, designated open space, land within the [BRACKET 1] overlay districts, and habitat of a state-listed or federally listed species.</w:t>
+        <w:t xml:space="preserve">"Environmentally sensitive area" means a mapped floodplain, an arroyo or stormwater conveyance, designated open space, land within the City's hillside, ridgeline, scenic, or open-space overlay districts, and habitat of a state-listed or federally listed species.</w:t>
       </w:r>
     </w:p>
     <w:p>
@@ -998,7 +998,7 @@
           <w:sz w:val="22"/>
           <w:szCs w:val="22"/>
         </w:rPr>
-        <w:t xml:space="preserve">Notice shall be given as required by Chapter 211 of the Texas Local Government Code and Title 20 of the City Code, including written notice to owners of property within [BRACKET 2] feet of the site.</w:t>
+        <w:t xml:space="preserve">Notice shall be given as required by Chapter 211 of the Texas Local Government Code and Title 20 of the City Code, including written notice to owners of property within 1,000 feet of the site.</w:t>
       </w:r>
     </w:p>
     <w:p>
@@ -1199,7 +1199,7 @@
           <w:sz w:val="22"/>
           <w:szCs w:val="22"/>
         </w:rPr>
-        <w:t xml:space="preserve">A hyperscale data center shall not withdraw more than [BRACKET 3] acre-feet of potable water per year, and shall supply not less than [BRACKET 4] percent of its total cooling water demand from reclaimed or other non-potable sources.</w:t>
+        <w:t xml:space="preserve">A hyperscale data center shall not withdraw more than 250 acre-feet of potable water per year, and shall supply not less than 90 percent of its total cooling water demand from reclaimed or other non-potable sources.</w:t>
       </w:r>
     </w:p>
     <w:p>
@@ -1243,7 +1243,7 @@
           <w:sz w:val="22"/>
           <w:szCs w:val="22"/>
         </w:rPr>
-        <w:t xml:space="preserve">Exceedance of the potable water limit shall be a violation subject to a penalty under Section 6.02, and continued exceedance for more than [BRACKET 5] days shall be grounds for revocation under Section 6.04.</w:t>
+        <w:t xml:space="preserve">Exceedance of the potable water limit shall be a violation subject to a penalty under Section 6.02, and continued exceedance for more than 30 days shall be grounds for revocation under Section 6.04.</w:t>
       </w:r>
     </w:p>
     <w:p>
@@ -1368,7 +1368,7 @@
           <w:sz w:val="22"/>
           <w:szCs w:val="22"/>
         </w:rPr>
-        <w:t xml:space="preserve">Failure to meet any limit in this Section shall be a violation subject to a penalty under Section 6.02, and the facility shall correct the exceedance within [BRACKET 6] days or be subject to revocation under Section 6.04.</w:t>
+        <w:t xml:space="preserve">Failure to meet any limit in this Section shall be a violation subject to a penalty under Section 6.02, and the facility shall correct the exceedance within 30 days or be subject to revocation under Section 6.04.</w:t>
       </w:r>
     </w:p>
     <w:p>
@@ -1449,7 +1449,7 @@
           <w:sz w:val="22"/>
           <w:szCs w:val="22"/>
         </w:rPr>
-        <w:t xml:space="preserve">Non-emergency operation of each engine shall not exceed [BRACKET 7] hours per engine per year, consistent with the limits for emergency engines under Title 40 Code of Federal Regulations Part 60, Subpart IIII.</w:t>
+        <w:t xml:space="preserve">Non-emergency operation of each engine shall not exceed 50 hours per engine per year, consistent with the limits for emergency engines under Title 40 Code of Federal Regulations Part 60, Subpart IIII.</w:t>
       </w:r>
     </w:p>
     <w:p>
@@ -1596,7 +1596,7 @@
           <w:sz w:val="22"/>
           <w:szCs w:val="22"/>
         </w:rPr>
-        <w:t xml:space="preserve">A hyperscale data center shall not produce sound exceeding [BRACKET 8] dBA between 7:00 a.m. and 10:00 p.m., or [BRACKET 9] dBA between 10:00 p.m. and 7:00 a.m., measured at the property line of any residential district or protected use.</w:t>
+        <w:t xml:space="preserve">A hyperscale data center shall not produce sound exceeding 55 dBA between 7:00 a.m. and 10:00 p.m., or 50 dBA between 10:00 p.m. and 7:00 a.m., measured at the property line of any residential district or protected use.</w:t>
       </w:r>
     </w:p>
     <w:p>
@@ -1936,7 +1936,7 @@
           <w:sz w:val="22"/>
           <w:szCs w:val="22"/>
         </w:rPr>
-        <w:t xml:space="preserve">Metering data shall be retained for not less than [BRACKET 10] years and made available to the City on request.</w:t>
+        <w:t xml:space="preserve">Metering data shall be retained for not less than 7 years and made available to the City on request.</w:t>
       </w:r>
     </w:p>
     <w:p>
@@ -2894,7 +2894,7 @@
           <w:sz w:val="20"/>
           <w:szCs w:val="20"/>
         </w:rPr>
-        <w:t xml:space="preserve">The dollar amounts in this schedule are set at or below the statutory maximum and may be set by the City Council at any amount up to that maximum. See bracket note [BRACKET 11].</w:t>
+        <w:t xml:space="preserve">The dollar amounts in this schedule are set at or below the statutory maximum and may be set by the City Council at any amount up to that maximum. These amounts are hereby adopted.</w:t>
       </w:r>
     </w:p>
     <w:p>
@@ -2940,7 +2940,7 @@
           <w:sz w:val="22"/>
           <w:szCs w:val="22"/>
         </w:rPr>
-        <w:t xml:space="preserve">After notice and a hearing, the City Council shall revoke a special permit on a finding that the permittee committed a violation that remains uncured for [BRACKET 12] days after written notice, or committed repeated violations. On revocation, the use shall cease.</w:t>
+        <w:t xml:space="preserve">After notice and a hearing, the City Council shall revoke a special permit on a finding that the permittee committed a violation that remains uncured for 30 days after written notice, or committed repeated violations. On revocation, the use shall cease.</w:t>
       </w:r>
     </w:p>
     <w:p>
@@ -3179,7 +3179,7 @@
           <w:sz w:val="22"/>
           <w:szCs w:val="22"/>
         </w:rPr>
-        <w:t xml:space="preserve">The amount shall be adjusted for inflation using [BRACKET 13], for example the Engineering News-Record Construction Cost Index.</w:t>
+        <w:t xml:space="preserve">The amount shall be adjusted for inflation using the Engineering News-Record Construction Cost Index (ENR-CCI).</w:t>
       </w:r>
     </w:p>
     <w:p>
@@ -3238,7 +3238,7 @@
           <w:sz w:val="22"/>
           <w:szCs w:val="22"/>
         </w:rPr>
-        <w:t xml:space="preserve">A facility that ceases operation for [BRACKET 14] consecutive months shall be deemed abandoned.</w:t>
+        <w:t xml:space="preserve">A facility that ceases operation for 12 consecutive months shall be deemed abandoned.</w:t>
       </w:r>
     </w:p>
     <w:p>
@@ -3260,7 +3260,7 @@
           <w:sz w:val="22"/>
           <w:szCs w:val="22"/>
         </w:rPr>
-        <w:t xml:space="preserve">On abandonment, the permittee shall complete decommissioning within [BRACKET 15] months.</w:t>
+        <w:t xml:space="preserve">On abandonment, the permittee shall complete decommissioning within 12 months.</w:t>
       </w:r>
     </w:p>
     <w:p>
@@ -3367,7 +3367,7 @@
           <w:sz w:val="22"/>
           <w:szCs w:val="22"/>
         </w:rPr>
-        <w:t xml:space="preserve">This Ordinance shall take effect on [BRACKET 16], after adoption and publication as required by law.</w:t>
+        <w:t xml:space="preserve">This Ordinance shall take effect upon its adoption and publication as required by law.</w:t>
       </w:r>
     </w:p>
     <w:p>
@@ -3389,7 +3389,7 @@
           <w:sz w:val="24"/>
           <w:szCs w:val="24"/>
         </w:rPr>
-        <w:t xml:space="preserve">SCHEDULE OF BRACKETED LOCAL POLICY DECISIONS</w:t>
+        <w:t xml:space="preserve">SCHEDULE OF PROPOSED LOCAL POLICY VALUES (NOW FILLED ABOVE)</w:t>
       </w:r>
     </w:p>
     <w:p>
@@ -3406,23 +3406,23 @@
           <w:sz w:val="20"/>
           <w:szCs w:val="20"/>
         </w:rPr>
-        <w:t xml:space="preserve">Each bracket below is a number or designation that is a local policy choice for the City Council to set. Every operative standard tied to a federal, state, or industry source is already fixed in the text above.</w:t>
-      </w:r>
-    </w:p>
-    <w:p>
-      <w:pPr>
-        <w:spacing w:after="20" w:before="20"/>
-        <w:ind w:left="360" w:hanging="360"/>
-      </w:pPr>
-      <w:r>
-        <w:rPr>
-          <w:rFonts w:ascii="Arial" w:cs="Arial" w:eastAsia="Arial" w:hAnsi="Arial"/>
-          <w:b/>
-          <w:bCs/>
-          <w:sz w:val="20"/>
-          <w:szCs w:val="20"/>
-        </w:rPr>
-        <w:t xml:space="preserve">[BRACKET 1] </w:t>
+        <w:t xml:space="preserve">Each value below is the policy choice proposed by the drafter and now filled into the text above. The City Council may set any of these within the stated legal limits. Every operative standard tied to a federal, state, or industry source is already fixed in the text above.</w:t>
+      </w:r>
+    </w:p>
+    <w:p>
+      <w:pPr>
+        <w:spacing w:after="20" w:before="20"/>
+        <w:ind w:left="360" w:hanging="360"/>
+      </w:pPr>
+      <w:r>
+        <w:rPr>
+          <w:rFonts w:ascii="Arial" w:cs="Arial" w:eastAsia="Arial" w:hAnsi="Arial"/>
+          <w:b/>
+          <w:bCs/>
+          <w:sz w:val="20"/>
+          <w:szCs w:val="20"/>
+        </w:rPr>
+        <w:t xml:space="preserve">Item 1 (proposed: City hillside/ridgeline/scenic/open-space overlays) </w:t>
       </w:r>
       <w:r>
         <w:rPr>
@@ -3456,7 +3456,7 @@
           <w:sz w:val="20"/>
           <w:szCs w:val="20"/>
         </w:rPr>
-        <w:t xml:space="preserve">[BRACKET 2] </w:t>
+        <w:t xml:space="preserve">Item 2 (proposed: 1,000 feet) </w:t>
       </w:r>
       <w:r>
         <w:rPr>
@@ -3490,7 +3490,7 @@
           <w:sz w:val="20"/>
           <w:szCs w:val="20"/>
         </w:rPr>
-        <w:t xml:space="preserve">[BRACKET 3] </w:t>
+        <w:t xml:space="preserve">Item 3 (proposed: 250 acre-feet/year) </w:t>
       </w:r>
       <w:r>
         <w:rPr>
@@ -3524,7 +3524,7 @@
           <w:sz w:val="20"/>
           <w:szCs w:val="20"/>
         </w:rPr>
-        <w:t xml:space="preserve">[BRACKET 4] </w:t>
+        <w:t xml:space="preserve">Item 4 (proposed: 90 percent) </w:t>
       </w:r>
       <w:r>
         <w:rPr>
@@ -3558,7 +3558,7 @@
           <w:sz w:val="20"/>
           <w:szCs w:val="20"/>
         </w:rPr>
-        <w:t xml:space="preserve">[BRACKET 5] </w:t>
+        <w:t xml:space="preserve">Item 5 (proposed: 30 days) </w:t>
       </w:r>
       <w:r>
         <w:rPr>
@@ -3592,7 +3592,7 @@
           <w:sz w:val="20"/>
           <w:szCs w:val="20"/>
         </w:rPr>
-        <w:t xml:space="preserve">[BRACKET 6] </w:t>
+        <w:t xml:space="preserve">Item 6 (proposed: 30 days) </w:t>
       </w:r>
       <w:r>
         <w:rPr>
@@ -3626,7 +3626,7 @@
           <w:sz w:val="20"/>
           <w:szCs w:val="20"/>
         </w:rPr>
-        <w:t xml:space="preserve">[BRACKET 7] </w:t>
+        <w:t xml:space="preserve">Item 7 (proposed: 50 hours/engine/year) </w:t>
       </w:r>
       <w:r>
         <w:rPr>
@@ -3660,7 +3660,7 @@
           <w:sz w:val="20"/>
           <w:szCs w:val="20"/>
         </w:rPr>
-        <w:t xml:space="preserve">[BRACKET 8] </w:t>
+        <w:t xml:space="preserve">Item 8 (proposed: 55 dBA day) </w:t>
       </w:r>
       <w:r>
         <w:rPr>
@@ -3694,7 +3694,7 @@
           <w:sz w:val="20"/>
           <w:szCs w:val="20"/>
         </w:rPr>
-        <w:t xml:space="preserve">[BRACKET 9] </w:t>
+        <w:t xml:space="preserve">Item 9 (proposed: 50 dBA night) </w:t>
       </w:r>
       <w:r>
         <w:rPr>
@@ -3728,7 +3728,7 @@
           <w:sz w:val="20"/>
           <w:szCs w:val="20"/>
         </w:rPr>
-        <w:t xml:space="preserve">[BRACKET 10] </w:t>
+        <w:t xml:space="preserve">Item 10 (proposed: 7 years) </w:t>
       </w:r>
       <w:r>
         <w:rPr>
@@ -3762,7 +3762,7 @@
           <w:sz w:val="20"/>
           <w:szCs w:val="20"/>
         </w:rPr>
-        <w:t xml:space="preserve">[BRACKET 11] </w:t>
+        <w:t xml:space="preserve">Item 11 (penalty schedule adopted as shown: $500 / $1,000 / $2,000 per day) </w:t>
       </w:r>
       <w:r>
         <w:rPr>
@@ -3796,7 +3796,7 @@
           <w:sz w:val="20"/>
           <w:szCs w:val="20"/>
         </w:rPr>
-        <w:t xml:space="preserve">[BRACKET 12] </w:t>
+        <w:t xml:space="preserve">Item 12 (proposed: 30 days) </w:t>
       </w:r>
       <w:r>
         <w:rPr>
@@ -3830,7 +3830,7 @@
           <w:sz w:val="20"/>
           <w:szCs w:val="20"/>
         </w:rPr>
-        <w:t xml:space="preserve">[BRACKET 13] </w:t>
+        <w:t xml:space="preserve">Item 13 (proposed: ENR Construction Cost Index) </w:t>
       </w:r>
       <w:r>
         <w:rPr>
@@ -3864,7 +3864,7 @@
           <w:sz w:val="20"/>
           <w:szCs w:val="20"/>
         </w:rPr>
-        <w:t xml:space="preserve">[BRACKET 14] </w:t>
+        <w:t xml:space="preserve">Item 14 (proposed: 12 months) </w:t>
       </w:r>
       <w:r>
         <w:rPr>
@@ -3898,7 +3898,7 @@
           <w:sz w:val="20"/>
           <w:szCs w:val="20"/>
         </w:rPr>
-        <w:t xml:space="preserve">[BRACKET 15] </w:t>
+        <w:t xml:space="preserve">Item 15 (proposed: 12 months) </w:t>
       </w:r>
       <w:r>
         <w:rPr>
@@ -3932,7 +3932,7 @@
           <w:sz w:val="20"/>
           <w:szCs w:val="20"/>
         </w:rPr>
-        <w:t xml:space="preserve">[BRACKET 16] </w:t>
+        <w:t xml:space="preserve">Item 16 (proposed: upon adoption and publication) </w:t>
       </w:r>
       <w:r>
         <w:rPr>

</xml_diff>